<commit_message>
final refactor - implemented orchestrator. minor ooptic changes on frontend
</commit_message>
<xml_diff>
--- a/docs/CAPEX_STORY_ECONOMIC_AND_METHODOLOGY_GUIDE.docx
+++ b/docs/CAPEX_STORY_ECONOMIC_AND_METHODOLOGY_GUIDE.docx
@@ -156,7 +156,7 @@
                 <w:sz w:val="18"/>
                 <w:szCs w:val="18"/>
               </w:rPr>
-              <w:t xml:space="preserve">03 August 2026, 13:35 UTC</w:t>
+              <w:t xml:space="preserve">06 August 2026, 13:19 UTC</w:t>
             </w:r>
           </w:p>
         </w:tc>
@@ -197,7 +197,7 @@
                 <w:sz w:val="18"/>
                 <w:szCs w:val="18"/>
               </w:rPr>
-              <w:t xml:space="preserve">8ed7615</w:t>
+              <w:t xml:space="preserve">467bc7e</w:t>
             </w:r>
           </w:p>
         </w:tc>
@@ -5025,7 +5025,7 @@
     </w:p>
     <w:p>
       <w:r>
-        <w:t xml:space="preserve">The common market sample runs from 2018-04-30 to 2026-07-30 across 5 official TRI histories. Using one common date matrix prevents an index with shorter coverage from being compared over a more favourable interval.</w:t>
+        <w:t xml:space="preserve">The common market sample runs from 2018-04-30 to 2026-08-06 across 5 official TRI histories. Using one common date matrix prevents an index with shorter coverage from being compared over a more favourable interval.</w:t>
       </w:r>
     </w:p>
     <w:p>
@@ -13349,7 +13349,7 @@
                 <w:sz w:val="14"/>
                 <w:szCs w:val="14"/>
               </w:rPr>
-              <w:t xml:space="preserve">Validated government investment artifact</w:t>
+              <w:t xml:space="preserve">Calculated GovernmentMetrics</w:t>
             </w:r>
           </w:p>
         </w:tc>
@@ -13367,7 +13367,7 @@
                 <w:sz w:val="14"/>
                 <w:szCs w:val="14"/>
               </w:rPr>
-              <w:t xml:space="preserve">Recorded upstream artifact; no URL in this chart contract</w:t>
+              <w:t xml:space="preserve">Recorded source metadata; no URL in this chart contract</w:t>
             </w:r>
           </w:p>
         </w:tc>
@@ -13531,7 +13531,7 @@
                 <w:sz w:val="14"/>
                 <w:szCs w:val="14"/>
               </w:rPr>
-              <w:t xml:space="preserve">Recorded upstream artifact; no URL in this chart contract</w:t>
+              <w:t xml:space="preserve">Recorded source metadata; no URL in this chart contract</w:t>
             </w:r>
           </w:p>
         </w:tc>

</xml_diff>